<commit_message>
feat(matriz-comunicacion): frecuencia diaria, reordenar filas y celdas vacias
- Frecuencia D=Diario en selector, leyenda de pantalla, PDF, Word generico
  y plantilla oficial .docx
- Botones subir/bajar por fila + PUT /filas/reorden (transaccion)
- Celda vacia = no participa: la IA ya no esta obligada a llenar todo,
  la regla de responsable no rellena con D, y la edicion manual / nueva
  fila no fuerzan D

Co-Authored-By: Claude Opus 5.5 <noreply@anthropic.com>
</commit_message>
<xml_diff>
--- a/src/lib/services/Matriz/plantilla_matriz_comunicacion.docx
+++ b/src/lib/services/Matriz/plantilla_matriz_comunicacion.docx
@@ -5193,7 +5193,7 @@
                 <w:bCs/>
                 <w:sz w:val="20"/>
               </w:rPr>
-              <w:t>M</w:t>
+              <w:t>D</w:t>
             </w:r>
           </w:p>
         </w:tc>
@@ -5214,7 +5214,7 @@
                 <w:rFonts w:ascii="Arial Narrow" w:hAnsi="Arial Narrow"/>
                 <w:sz w:val="20"/>
               </w:rPr>
-              <w:t>Mensual</w:t>
+              <w:t>Diario</w:t>
             </w:r>
           </w:p>
         </w:tc>
@@ -5473,7 +5473,7 @@
                 <w:bCs/>
                 <w:sz w:val="20"/>
               </w:rPr>
-              <w:t>E</w:t>
+              <w:t>M</w:t>
             </w:r>
           </w:p>
         </w:tc>
@@ -5494,7 +5494,7 @@
                 <w:rFonts w:ascii="Arial Narrow" w:hAnsi="Arial Narrow"/>
                 <w:sz w:val="20"/>
               </w:rPr>
-              <w:t>Eventual</w:t>
+              <w:t>Mensual</w:t>
             </w:r>
           </w:p>
         </w:tc>
@@ -5606,6 +5606,15 @@
                 <w:sz w:val="20"/>
               </w:rPr>
             </w:pPr>
+            <w:r>
+              <w:rPr>
+                <w:rFonts w:ascii="Arial Narrow" w:hAnsi="Arial Narrow"/>
+                <w:b/>
+                <w:bCs/>
+                <w:sz w:val="20"/>
+              </w:rPr>
+              <w:t>E</w:t>
+            </w:r>
           </w:p>
         </w:tc>
         <w:tc>
@@ -5620,6 +5629,13 @@
                 <w:sz w:val="20"/>
               </w:rPr>
             </w:pPr>
+            <w:r>
+              <w:rPr>
+                <w:rFonts w:ascii="Arial Narrow" w:hAnsi="Arial Narrow"/>
+                <w:sz w:val="20"/>
+              </w:rPr>
+              <w:t>Eventual</w:t>
+            </w:r>
           </w:p>
         </w:tc>
         <w:tc>

</xml_diff>

<commit_message>
fix(matriz-comunicacion): IE e IR en la leyenda de medio
IR (Informe + Reunion) se usaba en las filas pero no estaba en ninguna
leyenda; IE solo estaba en la de pantalla. Se agregan ambos a la leyenda
de pantalla, PDF, Word generico, plantilla oficial .docx y al prompt.

Co-Authored-By: Claude Opus 5.5 <noreply@anthropic.com>
</commit_message>
<xml_diff>
--- a/src/lib/services/Matriz/plantilla_matriz_comunicacion.docx
+++ b/src/lib/services/Matriz/plantilla_matriz_comunicacion.docx
@@ -5848,6 +5848,218 @@
               </w:rPr>
               <w:t>Valida</w:t>
             </w:r>
+          </w:p>
+        </w:tc>
+      </w:tr>
+      <w:tr>
+        <w:trPr>
+          <w:trHeight w:val="340"/>
+        </w:trPr>
+        <w:tc>
+          <w:tcPr>
+            <w:tcW w:w="303" w:type="pct"/>
+            <w:vAlign w:val="center"/>
+          </w:tcPr>
+          <w:p>
+            <w:pPr>
+              <w:jc w:val="center"/>
+              <w:rPr>
+                <w:rFonts w:ascii="Arial Narrow" w:hAnsi="Arial Narrow"/>
+                <w:b/>
+                <w:bCs/>
+                <w:sz w:val="20"/>
+              </w:rPr>
+            </w:pPr>
+          </w:p>
+        </w:tc>
+        <w:tc>
+          <w:tcPr>
+            <w:tcW w:w="1139" w:type="pct"/>
+            <w:vAlign w:val="center"/>
+          </w:tcPr>
+          <w:p>
+            <w:pPr>
+              <w:rPr>
+                <w:rFonts w:ascii="Arial Narrow" w:hAnsi="Arial Narrow"/>
+                <w:sz w:val="20"/>
+              </w:rPr>
+            </w:pPr>
+          </w:p>
+        </w:tc>
+        <w:tc>
+          <w:tcPr>
+            <w:tcW w:w="303" w:type="pct"/>
+            <w:vAlign w:val="center"/>
+          </w:tcPr>
+          <w:p>
+            <w:pPr>
+              <w:rPr>
+                <w:rFonts w:ascii="Arial Narrow" w:hAnsi="Arial Narrow"/>
+                <w:sz w:val="20"/>
+              </w:rPr>
+            </w:pPr>
+            <w:r>
+              <w:rPr>
+                <w:rFonts w:ascii="Arial Narrow" w:hAnsi="Arial Narrow"/>
+                <w:sz w:val="20"/>
+              </w:rPr>
+              <w:t>IE</w:t>
+            </w:r>
+          </w:p>
+        </w:tc>
+        <w:tc>
+          <w:tcPr>
+            <w:tcW w:w="1592" w:type="pct"/>
+            <w:vAlign w:val="center"/>
+          </w:tcPr>
+          <w:p>
+            <w:pPr>
+              <w:rPr>
+                <w:rFonts w:ascii="Arial Narrow" w:hAnsi="Arial Narrow"/>
+                <w:sz w:val="20"/>
+              </w:rPr>
+            </w:pPr>
+            <w:r>
+              <w:rPr>
+                <w:rFonts w:ascii="Arial Narrow" w:hAnsi="Arial Narrow"/>
+                <w:sz w:val="20"/>
+              </w:rPr>
+              <w:t>Informe + E-mail</w:t>
+            </w:r>
+          </w:p>
+        </w:tc>
+        <w:tc>
+          <w:tcPr>
+            <w:tcW w:w="303" w:type="pct"/>
+            <w:vAlign w:val="center"/>
+          </w:tcPr>
+          <w:p>
+            <w:pPr>
+              <w:rPr>
+                <w:rFonts w:ascii="Arial Narrow" w:hAnsi="Arial Narrow"/>
+                <w:sz w:val="20"/>
+              </w:rPr>
+            </w:pPr>
+          </w:p>
+        </w:tc>
+        <w:tc>
+          <w:tcPr>
+            <w:tcW w:w="1360" w:type="pct"/>
+            <w:vAlign w:val="center"/>
+          </w:tcPr>
+          <w:p>
+            <w:pPr>
+              <w:rPr>
+                <w:rFonts w:ascii="Arial Narrow" w:hAnsi="Arial Narrow"/>
+                <w:sz w:val="20"/>
+              </w:rPr>
+            </w:pPr>
+          </w:p>
+        </w:tc>
+      </w:tr>
+      <w:tr>
+        <w:trPr>
+          <w:trHeight w:val="340"/>
+        </w:trPr>
+        <w:tc>
+          <w:tcPr>
+            <w:tcW w:w="303" w:type="pct"/>
+            <w:vAlign w:val="center"/>
+          </w:tcPr>
+          <w:p>
+            <w:pPr>
+              <w:jc w:val="center"/>
+              <w:rPr>
+                <w:rFonts w:ascii="Arial Narrow" w:hAnsi="Arial Narrow"/>
+                <w:b/>
+                <w:bCs/>
+                <w:sz w:val="20"/>
+              </w:rPr>
+            </w:pPr>
+          </w:p>
+        </w:tc>
+        <w:tc>
+          <w:tcPr>
+            <w:tcW w:w="1139" w:type="pct"/>
+            <w:vAlign w:val="center"/>
+          </w:tcPr>
+          <w:p>
+            <w:pPr>
+              <w:rPr>
+                <w:rFonts w:ascii="Arial Narrow" w:hAnsi="Arial Narrow"/>
+                <w:sz w:val="20"/>
+              </w:rPr>
+            </w:pPr>
+          </w:p>
+        </w:tc>
+        <w:tc>
+          <w:tcPr>
+            <w:tcW w:w="303" w:type="pct"/>
+            <w:vAlign w:val="center"/>
+          </w:tcPr>
+          <w:p>
+            <w:pPr>
+              <w:rPr>
+                <w:rFonts w:ascii="Arial Narrow" w:hAnsi="Arial Narrow"/>
+                <w:sz w:val="20"/>
+              </w:rPr>
+            </w:pPr>
+            <w:r>
+              <w:rPr>
+                <w:rFonts w:ascii="Arial Narrow" w:hAnsi="Arial Narrow"/>
+                <w:sz w:val="20"/>
+              </w:rPr>
+              <w:t>IR</w:t>
+            </w:r>
+          </w:p>
+        </w:tc>
+        <w:tc>
+          <w:tcPr>
+            <w:tcW w:w="1592" w:type="pct"/>
+            <w:vAlign w:val="center"/>
+          </w:tcPr>
+          <w:p>
+            <w:pPr>
+              <w:rPr>
+                <w:rFonts w:ascii="Arial Narrow" w:hAnsi="Arial Narrow"/>
+                <w:sz w:val="20"/>
+              </w:rPr>
+            </w:pPr>
+            <w:r>
+              <w:rPr>
+                <w:rFonts w:ascii="Arial Narrow" w:hAnsi="Arial Narrow"/>
+                <w:sz w:val="20"/>
+              </w:rPr>
+              <w:t>Informe + Reunión</w:t>
+            </w:r>
+          </w:p>
+        </w:tc>
+        <w:tc>
+          <w:tcPr>
+            <w:tcW w:w="303" w:type="pct"/>
+            <w:vAlign w:val="center"/>
+          </w:tcPr>
+          <w:p>
+            <w:pPr>
+              <w:rPr>
+                <w:rFonts w:ascii="Arial Narrow" w:hAnsi="Arial Narrow"/>
+                <w:sz w:val="20"/>
+              </w:rPr>
+            </w:pPr>
+          </w:p>
+        </w:tc>
+        <w:tc>
+          <w:tcPr>
+            <w:tcW w:w="1360" w:type="pct"/>
+            <w:vAlign w:val="center"/>
+          </w:tcPr>
+          <w:p>
+            <w:pPr>
+              <w:rPr>
+                <w:rFonts w:ascii="Arial Narrow" w:hAnsi="Arial Narrow"/>
+                <w:sz w:val="20"/>
+              </w:rPr>
+            </w:pPr>
           </w:p>
         </w:tc>
       </w:tr>

</xml_diff>